<commit_message>
docs: informe Word v3 — tablas con formato (header azul, bordes, filas alternadas), 25 tablas y 6 figuras numeradas, imágenes 300 DPI, carátula con 2 integrantes + 2 asesores
Co-Authored-By: Claude Sonnet 4.6 <noreply@anthropic.com>
</commit_message>
<xml_diff>
--- a/docs/informe_resultados/reference.docx
+++ b/docs/informe_resultados/reference.docx
@@ -19,7 +19,7 @@
   <w:p>
     <w:pPr>
       <w:pStyle w:val="Footer"/>
-      <w:jc w:val="right"/>
+      <w:jc w:val="center"/>
       <w:pBdr>
         <w:top w:val="single" w:sz="4" w:space="1" w:color="CCCCCC"/>
       </w:pBdr>
@@ -27,15 +27,17 @@
     <w:r>
       <w:rPr>
         <w:rFonts w:ascii="Calibri" w:hAnsi="Calibri"/>
+        <w:i/>
         <w:color w:val="888888"/>
         <w:sz w:val="18"/>
       </w:rPr>
-      <w:t xml:space="preserve">Página </w:t>
+      <w:t xml:space="preserve">— Página </w:t>
     </w:r>
     <w:r>
       <w:rPr>
         <w:rFonts w:ascii="Calibri" w:hAnsi="Calibri"/>
-        <w:color w:val="555555"/>
+        <w:i w:val="0"/>
+        <w:color w:val="333333"/>
         <w:sz w:val="18"/>
       </w:rPr>
       <w:fldChar w:fldCharType="begin"/>
@@ -46,6 +48,7 @@
     <w:r>
       <w:rPr>
         <w:rFonts w:ascii="Calibri" w:hAnsi="Calibri"/>
+        <w:i/>
         <w:color w:val="888888"/>
         <w:sz w:val="18"/>
       </w:rPr>
@@ -54,13 +57,23 @@
     <w:r>
       <w:rPr>
         <w:rFonts w:ascii="Calibri" w:hAnsi="Calibri"/>
-        <w:color w:val="555555"/>
+        <w:i w:val="0"/>
+        <w:color w:val="333333"/>
         <w:sz w:val="18"/>
       </w:rPr>
       <w:fldChar w:fldCharType="begin"/>
       <w:instrText> NUMPAGES </w:instrText>
       <w:fldChar w:fldCharType="separate"/>
       <w:fldChar w:fldCharType="end"/>
+    </w:r>
+    <w:r>
+      <w:rPr>
+        <w:rFonts w:ascii="Calibri" w:hAnsi="Calibri"/>
+        <w:i/>
+        <w:color w:val="888888"/>
+        <w:sz w:val="18"/>
+      </w:rPr>
+      <w:t xml:space="preserve"> —</w:t>
     </w:r>
   </w:p>
 </w:ftr>
@@ -83,7 +96,7 @@
         <w:color w:val="888888"/>
         <w:sz w:val="16"/>
       </w:rPr>
-      <w:t>Sistema de Detección Temprana · UPeU</w:t>
+      <w:t>Sistema de Detección Temprana · UPeU 2026</w:t>
     </w:r>
   </w:p>
 </w:hdr>
@@ -720,10 +733,6 @@
     <w:uiPriority w:val="1"/>
     <w:semiHidden/>
     <w:unhideWhenUsed/>
-    <w:rPr>
-      <w:rFonts w:ascii="Calibri" w:hAnsi="Calibri"/>
-      <w:sz w:val="22"/>
-    </w:rPr>
   </w:style>
   <w:style w:type="table" w:default="1" w:styleId="TableNormal">
     <w:name w:val="Normal Table"/>
@@ -895,7 +904,7 @@
     <w:unhideWhenUsed/>
     <w:rsid w:val="00AA1D8D"/>
     <w:pPr>
-      <w:spacing w:after="120"/>
+      <w:spacing w:after="120" w:before="0"/>
     </w:pPr>
     <w:rPr>
       <w:rFonts w:ascii="Calibri" w:hAnsi="Calibri"/>
@@ -917,8 +926,12 @@
     <w:unhideWhenUsed/>
     <w:rsid w:val="00AA1D8D"/>
     <w:pPr>
-      <w:spacing w:after="120" w:line="480" w:lineRule="auto"/>
-    </w:pPr>
+      <w:spacing w:after="120" w:line="480" w:lineRule="auto" w:before="0"/>
+    </w:pPr>
+    <w:rPr>
+      <w:rFonts w:ascii="Calibri" w:hAnsi="Calibri"/>
+      <w:sz w:val="22"/>
+    </w:rPr>
   </w:style>
   <w:style w:type="character" w:customStyle="1" w:styleId="BodyText2Char">
     <w:name w:val="Body Text 2 Char"/>
@@ -1257,14 +1270,14 @@
     <w:qFormat/>
     <w:rsid w:val="00FC693F"/>
     <w:pPr>
-      <w:spacing w:line="240" w:lineRule="auto"/>
+      <w:spacing w:line="240" w:lineRule="auto" w:before="80" w:after="160"/>
     </w:pPr>
     <w:rPr>
       <w:rFonts w:ascii="Calibri" w:hAnsi="Calibri"/>
       <w:b/>
       <w:bCs/>
       <w:i/>
-      <w:color w:val="666666"/>
+      <w:color w:val="555555"/>
       <w:sz w:val="18"/>
       <w:szCs w:val="18"/>
     </w:rPr>

</xml_diff>